<commit_message>
feat: publish 629-slide DevOps AWS courseware v14
</commit_message>
<xml_diff>
--- a/courseware/LG-DevOps Engineering on AWS.docx
+++ b/courseware/LG-DevOps Engineering on AWS.docx
@@ -179,7 +179,7 @@
           <w:color w:val="1F6FEB"/>
           <w:sz w:val="24"/>
         </w:rPr>
-        <w:t>Version 12</w:t>
+        <w:t>Version 14</w:t>
       </w:r>
     </w:p>
     <w:p>
@@ -631,6 +631,122 @@
           </w:p>
         </w:tc>
       </w:tr>
+      <w:tr>
+        <w:tc>
+          <w:tcPr>
+            <w:tcW w:type="dxa" w:w="2160"/>
+          </w:tcPr>
+          <w:p>
+            <w:r/>
+            <w:r>
+              <w:rPr>
+                <w:sz w:val="22"/>
+              </w:rPr>
+              <w:t>13</w:t>
+            </w:r>
+          </w:p>
+        </w:tc>
+        <w:tc>
+          <w:tcPr>
+            <w:tcW w:type="dxa" w:w="2160"/>
+          </w:tcPr>
+          <w:p>
+            <w:r/>
+            <w:r>
+              <w:rPr>
+                <w:sz w:val="22"/>
+              </w:rPr>
+              <w:t>23 August 2026</w:t>
+            </w:r>
+          </w:p>
+        </w:tc>
+        <w:tc>
+          <w:tcPr>
+            <w:tcW w:type="dxa" w:w="2160"/>
+          </w:tcPr>
+          <w:p>
+            <w:r/>
+            <w:r>
+              <w:rPr>
+                <w:sz w:val="22"/>
+              </w:rPr>
+              <w:t>Aligned to the expanded 589-slide v13 trainer deck, which blends the current courseware with vetted legacy and related AWS DevOps certification coverage. Detailed click-by-click procedures remain in this Learner Guide and the individual lab folders rather than the PPT. The practical structure remains 25 self-contained labs — exactly five labs per day — with unchanged K1–K7, A1–A6 and LO1–LO6 mappings. No practice exam was added.</w:t>
+            </w:r>
+          </w:p>
+        </w:tc>
+        <w:tc>
+          <w:tcPr>
+            <w:tcW w:type="dxa" w:w="2160"/>
+          </w:tcPr>
+          <w:p>
+            <w:r/>
+            <w:r>
+              <w:rPr>
+                <w:sz w:val="22"/>
+              </w:rPr>
+              <w:t>Dr Alfred Ang</w:t>
+            </w:r>
+          </w:p>
+        </w:tc>
+      </w:tr>
+      <w:tr>
+        <w:tc>
+          <w:tcPr>
+            <w:tcW w:type="dxa" w:w="2160"/>
+          </w:tcPr>
+          <w:p>
+            <w:r/>
+            <w:r>
+              <w:rPr>
+                <w:sz w:val="22"/>
+              </w:rPr>
+              <w:t>14</w:t>
+            </w:r>
+          </w:p>
+        </w:tc>
+        <w:tc>
+          <w:tcPr>
+            <w:tcW w:type="dxa" w:w="2160"/>
+          </w:tcPr>
+          <w:p>
+            <w:r/>
+            <w:r>
+              <w:rPr>
+                <w:sz w:val="22"/>
+              </w:rPr>
+              <w:t>23 August 2026</w:t>
+            </w:r>
+          </w:p>
+        </w:tc>
+        <w:tc>
+          <w:tcPr>
+            <w:tcW w:type="dxa" w:w="2160"/>
+          </w:tcPr>
+          <w:p>
+            <w:r/>
+            <w:r>
+              <w:rPr>
+                <w:sz w:val="22"/>
+              </w:rPr>
+              <w:t>Expanded the visual trainer deck beyond 600 slides by adding 40 vetted AWS DevOps architecture-map analyses from the related certification course. Aligned to the 629-slide v14 deck; detailed procedures remain in this Learner Guide and the 25 individual lab folders. No practice exam was added.</w:t>
+            </w:r>
+          </w:p>
+        </w:tc>
+        <w:tc>
+          <w:tcPr>
+            <w:tcW w:type="dxa" w:w="2160"/>
+          </w:tcPr>
+          <w:p>
+            <w:r/>
+            <w:r>
+              <w:rPr>
+                <w:sz w:val="22"/>
+              </w:rPr>
+              <w:t>Dr Alfred Ang</w:t>
+            </w:r>
+          </w:p>
+        </w:tc>
+      </w:tr>
     </w:tbl>
     <w:p>
       <w:r>
@@ -693,7 +809,7 @@
           <w:sz w:val="22"/>
           <w:color w:val="222833"/>
         </w:rPr>
-        <w:t xml:space="preserve">7</w:t>
+        <w:t xml:space="preserve">8</w:t>
       </w:r>
       <w:r>
         <w:fldChar w:fldCharType="end"/>
@@ -728,7 +844,7 @@
           <w:sz w:val="22"/>
           <w:color w:val="222833"/>
         </w:rPr>
-        <w:t xml:space="preserve">7</w:t>
+        <w:t xml:space="preserve">8</w:t>
       </w:r>
       <w:r>
         <w:fldChar w:fldCharType="end"/>
@@ -763,7 +879,7 @@
           <w:sz w:val="22"/>
           <w:color w:val="222833"/>
         </w:rPr>
-        <w:t xml:space="preserve">7</w:t>
+        <w:t xml:space="preserve">8</w:t>
       </w:r>
       <w:r>
         <w:fldChar w:fldCharType="end"/>
@@ -798,7 +914,7 @@
           <w:sz w:val="22"/>
           <w:color w:val="222833"/>
         </w:rPr>
-        <w:t xml:space="preserve">8</w:t>
+        <w:t xml:space="preserve">9</w:t>
       </w:r>
       <w:r>
         <w:fldChar w:fldCharType="end"/>
@@ -833,7 +949,7 @@
           <w:sz w:val="22"/>
           <w:color w:val="222833"/>
         </w:rPr>
-        <w:t xml:space="preserve">9</w:t>
+        <w:t xml:space="preserve">10</w:t>
       </w:r>
       <w:r>
         <w:fldChar w:fldCharType="end"/>
@@ -867,7 +983,7 @@
           <w:sz w:val="22"/>
           <w:color w:val="222833"/>
         </w:rPr>
-        <w:t xml:space="preserve">9</w:t>
+        <w:t xml:space="preserve">10</w:t>
       </w:r>
       <w:r>
         <w:fldChar w:fldCharType="end"/>
@@ -901,7 +1017,7 @@
           <w:sz w:val="22"/>
           <w:color w:val="222833"/>
         </w:rPr>
-        <w:t xml:space="preserve">13</w:t>
+        <w:t xml:space="preserve">14</w:t>
       </w:r>
       <w:r>
         <w:fldChar w:fldCharType="end"/>
@@ -935,7 +1051,7 @@
           <w:sz w:val="22"/>
           <w:color w:val="222833"/>
         </w:rPr>
-        <w:t xml:space="preserve">17</w:t>
+        <w:t xml:space="preserve">18</w:t>
       </w:r>
       <w:r>
         <w:fldChar w:fldCharType="end"/>
@@ -969,7 +1085,7 @@
           <w:sz w:val="22"/>
           <w:color w:val="222833"/>
         </w:rPr>
-        <w:t xml:space="preserve">21</w:t>
+        <w:t xml:space="preserve">22</w:t>
       </w:r>
       <w:r>
         <w:fldChar w:fldCharType="end"/>
@@ -1003,7 +1119,7 @@
           <w:sz w:val="22"/>
           <w:color w:val="222833"/>
         </w:rPr>
-        <w:t xml:space="preserve">25</w:t>
+        <w:t xml:space="preserve">26</w:t>
       </w:r>
       <w:r>
         <w:fldChar w:fldCharType="end"/>
@@ -1038,7 +1154,7 @@
           <w:sz w:val="22"/>
           <w:color w:val="222833"/>
         </w:rPr>
-        <w:t xml:space="preserve">29</w:t>
+        <w:t xml:space="preserve">30</w:t>
       </w:r>
       <w:r>
         <w:fldChar w:fldCharType="end"/>
@@ -1072,7 +1188,7 @@
           <w:sz w:val="22"/>
           <w:color w:val="222833"/>
         </w:rPr>
-        <w:t xml:space="preserve">29</w:t>
+        <w:t xml:space="preserve">30</w:t>
       </w:r>
       <w:r>
         <w:fldChar w:fldCharType="end"/>
@@ -1106,7 +1222,7 @@
           <w:sz w:val="22"/>
           <w:color w:val="222833"/>
         </w:rPr>
-        <w:t xml:space="preserve">34</w:t>
+        <w:t xml:space="preserve">35</w:t>
       </w:r>
       <w:r>
         <w:fldChar w:fldCharType="end"/>
@@ -1140,7 +1256,7 @@
           <w:sz w:val="22"/>
           <w:color w:val="222833"/>
         </w:rPr>
-        <w:t xml:space="preserve">38</w:t>
+        <w:t xml:space="preserve">39</w:t>
       </w:r>
       <w:r>
         <w:fldChar w:fldCharType="end"/>
@@ -1174,7 +1290,7 @@
           <w:sz w:val="22"/>
           <w:color w:val="222833"/>
         </w:rPr>
-        <w:t xml:space="preserve">42</w:t>
+        <w:t xml:space="preserve">43</w:t>
       </w:r>
       <w:r>
         <w:fldChar w:fldCharType="end"/>
@@ -1208,7 +1324,7 @@
           <w:sz w:val="22"/>
           <w:color w:val="222833"/>
         </w:rPr>
-        <w:t xml:space="preserve">45</w:t>
+        <w:t xml:space="preserve">46</w:t>
       </w:r>
       <w:r>
         <w:fldChar w:fldCharType="end"/>
@@ -1243,7 +1359,7 @@
           <w:sz w:val="22"/>
           <w:color w:val="222833"/>
         </w:rPr>
-        <w:t xml:space="preserve">50</w:t>
+        <w:t xml:space="preserve">51</w:t>
       </w:r>
       <w:r>
         <w:fldChar w:fldCharType="end"/>
@@ -1277,7 +1393,7 @@
           <w:sz w:val="22"/>
           <w:color w:val="222833"/>
         </w:rPr>
-        <w:t xml:space="preserve">50</w:t>
+        <w:t xml:space="preserve">51</w:t>
       </w:r>
       <w:r>
         <w:fldChar w:fldCharType="end"/>
@@ -1311,7 +1427,7 @@
           <w:sz w:val="22"/>
           <w:color w:val="222833"/>
         </w:rPr>
-        <w:t xml:space="preserve">55</w:t>
+        <w:t xml:space="preserve">56</w:t>
       </w:r>
       <w:r>
         <w:fldChar w:fldCharType="end"/>
@@ -1345,7 +1461,7 @@
           <w:sz w:val="22"/>
           <w:color w:val="222833"/>
         </w:rPr>
-        <w:t xml:space="preserve">59</w:t>
+        <w:t xml:space="preserve">60</w:t>
       </w:r>
       <w:r>
         <w:fldChar w:fldCharType="end"/>
@@ -1379,7 +1495,7 @@
           <w:sz w:val="22"/>
           <w:color w:val="222833"/>
         </w:rPr>
-        <w:t xml:space="preserve">64</w:t>
+        <w:t xml:space="preserve">65</w:t>
       </w:r>
       <w:r>
         <w:fldChar w:fldCharType="end"/>
@@ -1413,7 +1529,7 @@
           <w:sz w:val="22"/>
           <w:color w:val="222833"/>
         </w:rPr>
-        <w:t xml:space="preserve">68</w:t>
+        <w:t xml:space="preserve">69</w:t>
       </w:r>
       <w:r>
         <w:fldChar w:fldCharType="end"/>
@@ -1448,7 +1564,7 @@
           <w:sz w:val="22"/>
           <w:color w:val="222833"/>
         </w:rPr>
-        <w:t xml:space="preserve">73</w:t>
+        <w:t xml:space="preserve">74</w:t>
       </w:r>
       <w:r>
         <w:fldChar w:fldCharType="end"/>
@@ -1482,7 +1598,7 @@
           <w:sz w:val="22"/>
           <w:color w:val="222833"/>
         </w:rPr>
-        <w:t xml:space="preserve">73</w:t>
+        <w:t xml:space="preserve">74</w:t>
       </w:r>
       <w:r>
         <w:fldChar w:fldCharType="end"/>
@@ -1516,7 +1632,7 @@
           <w:sz w:val="22"/>
           <w:color w:val="222833"/>
         </w:rPr>
-        <w:t xml:space="preserve">78</w:t>
+        <w:t xml:space="preserve">79</w:t>
       </w:r>
       <w:r>
         <w:fldChar w:fldCharType="end"/>
@@ -1550,7 +1666,7 @@
           <w:sz w:val="22"/>
           <w:color w:val="222833"/>
         </w:rPr>
-        <w:t xml:space="preserve">82</w:t>
+        <w:t xml:space="preserve">83</w:t>
       </w:r>
       <w:r>
         <w:fldChar w:fldCharType="end"/>
@@ -1585,7 +1701,7 @@
           <w:sz w:val="22"/>
           <w:color w:val="222833"/>
         </w:rPr>
-        <w:t xml:space="preserve">86</w:t>
+        <w:t xml:space="preserve">87</w:t>
       </w:r>
       <w:r>
         <w:fldChar w:fldCharType="end"/>
@@ -1619,7 +1735,7 @@
           <w:sz w:val="22"/>
           <w:color w:val="222833"/>
         </w:rPr>
-        <w:t xml:space="preserve">86</w:t>
+        <w:t xml:space="preserve">87</w:t>
       </w:r>
       <w:r>
         <w:fldChar w:fldCharType="end"/>
@@ -1653,7 +1769,7 @@
           <w:sz w:val="22"/>
           <w:color w:val="222833"/>
         </w:rPr>
-        <w:t xml:space="preserve">90</w:t>
+        <w:t xml:space="preserve">91</w:t>
       </w:r>
       <w:r>
         <w:fldChar w:fldCharType="end"/>
@@ -1688,7 +1804,7 @@
           <w:sz w:val="22"/>
           <w:color w:val="222833"/>
         </w:rPr>
-        <w:t xml:space="preserve">95</w:t>
+        <w:t xml:space="preserve">96</w:t>
       </w:r>
       <w:r>
         <w:fldChar w:fldCharType="end"/>
@@ -1722,7 +1838,7 @@
           <w:sz w:val="22"/>
           <w:color w:val="222833"/>
         </w:rPr>
-        <w:t xml:space="preserve">95</w:t>
+        <w:t xml:space="preserve">96</w:t>
       </w:r>
       <w:r>
         <w:fldChar w:fldCharType="end"/>
@@ -1756,7 +1872,7 @@
           <w:sz w:val="22"/>
           <w:color w:val="222833"/>
         </w:rPr>
-        <w:t xml:space="preserve">100</w:t>
+        <w:t xml:space="preserve">101</w:t>
       </w:r>
       <w:r>
         <w:fldChar w:fldCharType="end"/>
@@ -1790,7 +1906,7 @@
           <w:sz w:val="22"/>
           <w:color w:val="222833"/>
         </w:rPr>
-        <w:t xml:space="preserve">104</w:t>
+        <w:t xml:space="preserve">105</w:t>
       </w:r>
       <w:r>
         <w:fldChar w:fldCharType="end"/>
@@ -1824,7 +1940,7 @@
           <w:sz w:val="22"/>
           <w:color w:val="222833"/>
         </w:rPr>
-        <w:t xml:space="preserve">108</w:t>
+        <w:t xml:space="preserve">109</w:t>
       </w:r>
       <w:r>
         <w:fldChar w:fldCharType="end"/>
@@ -1858,7 +1974,7 @@
           <w:sz w:val="22"/>
           <w:color w:val="222833"/>
         </w:rPr>
-        <w:t xml:space="preserve">113</w:t>
+        <w:t xml:space="preserve">114</w:t>
       </w:r>
       <w:r>
         <w:fldChar w:fldCharType="end"/>
@@ -1893,7 +2009,7 @@
           <w:sz w:val="22"/>
           <w:color w:val="222833"/>
         </w:rPr>
-        <w:t xml:space="preserve">118</w:t>
+        <w:t xml:space="preserve">119</w:t>
       </w:r>
       <w:r>
         <w:fldChar w:fldCharType="end"/>
@@ -1928,7 +2044,7 @@
           <w:sz w:val="22"/>
           <w:color w:val="222833"/>
         </w:rPr>
-        <w:t xml:space="preserve">118</w:t>
+        <w:t xml:space="preserve">119</w:t>
       </w:r>
       <w:r>
         <w:fldChar w:fldCharType="end"/>
@@ -1963,7 +2079,7 @@
           <w:sz w:val="22"/>
           <w:color w:val="222833"/>
         </w:rPr>
-        <w:t xml:space="preserve">119</w:t>
+        <w:t xml:space="preserve">120</w:t>
       </w:r>
       <w:r>
         <w:fldChar w:fldCharType="end"/>

</xml_diff>